<commit_message>
Regenerate language figure to correct ~81% (langid, merged text); fix report language table 61%->81%
</commit_message>
<xml_diff>
--- a/downloads/Rakuten_Project_Report.docx
+++ b/downloads/Rakuten_Project_Report.docx
@@ -1119,7 +1119,7 @@
       <w:r>
         <w:drawing>
           <wp:inline xmlns:a="http://schemas.openxmlformats.org/drawingml/2006/main" xmlns:pic="http://schemas.openxmlformats.org/drawingml/2006/picture">
-            <wp:extent cx="4206240" cy="2518577"/>
+            <wp:extent cx="4206240" cy="2453640"/>
             <wp:docPr id="4" name="Picture 4"/>
             <wp:cNvGraphicFramePr>
               <a:graphicFrameLocks noChangeAspect="1"/>
@@ -1140,7 +1140,7 @@
                   <pic:spPr>
                     <a:xfrm>
                       <a:off x="0" y="0"/>
-                      <a:ext cx="4206240" cy="2518577"/>
+                      <a:ext cx="4206240" cy="2453640"/>
                     </a:xfrm>
                     <a:prstGeom prst="rect"/>
                   </pic:spPr>
@@ -1844,7 +1844,7 @@
                 <w:sz w:val="20"/>
                 <w:rFonts w:ascii="Times New Roman" w:hAnsi="Times New Roman" w:cs="Times New Roman"/>
               </w:rPr>
-              <w:t>French ~61%, English ~22%, German ~7%</w:t>
+              <w:t>French ~81%, English ~10%, German ~1% (langid, merged text)</w:t>
             </w:r>
           </w:p>
         </w:tc>

</xml_diff>

<commit_message>
Correct word-processing methodology to match GitHub pipeline: TweetTokenizer, FR/EN/DE stopword removal, Snowball stemming, keep accents; fix wordfreq wording
</commit_message>
<xml_diff>
--- a/downloads/Rakuten_Project_Report.docx
+++ b/downloads/Rakuten_Project_Report.docx
@@ -1210,7 +1210,7 @@
           <w:sz w:val="22"/>
           <w:rFonts w:ascii="Times New Roman" w:hAnsi="Times New Roman" w:cs="Times New Roman"/>
         </w:rPr>
-        <w:t>Counting how often each word occurs shows that the most frequent words are almost all stopwords, such as de, la, et, pour and les (Figure 5). These appear in nearly every listing and carry no category signal, which is precisely why TF-IDF [6] weights them down through the inverse-document-frequency term. At the other extreme, the least frequent words are one-off typos and serial numbers that appear only once. Both extremes are removed: rare tokens by the minimum-document-frequency threshold, and the long tail by capping the vocabulary at the 20,000 most useful terms; the discriminative words sit in between.</w:t>
+        <w:t>Counting how often each word occurs shows that the most frequent words are almost all stopwords, such as de, la, et, pour and les (Figure 5). These appear in nearly every listing and carry no category signal, which is why they are removed with the NLTK French, English and German stopword lists before vectorisation; TF-IDF [6] then further down-weights any common terms that survive through its inverse-document-frequency term. At the other extreme, the least frequent words are one-off typos and serial numbers that appear only once; these are removed by the minimum-document-frequency threshold and by capping the vocabulary at the 20,000 most useful terms. The discriminative words sit in between.</w:t>
       </w:r>
     </w:p>
     <w:p>
@@ -2047,7 +2047,7 @@
           <w:sz w:val="22"/>
           <w:rFonts w:ascii="Times New Roman" w:hAnsi="Times New Roman" w:cs="Times New Roman"/>
         </w:rPr>
-        <w:t>The following operations act on each listing independently, so they carry no information between rows and are applied to the whole dataset before splitting. The HTML is stripped with BeautifulSoup [7], which decodes entities and inserts separators, so that a fragment such as rouge&lt;br&gt;bleu becomes rouge bleu rather than rougebleu, as a naive regular expression would produce. The designation and cleaned description are then merged into a single text field, which is lowercased and accent-folded to reduce vocabulary fragmentation. Finally, a binary desc_missing indicator is built from the original column, before any fill.</w:t>
+        <w:t>The following operations act on each listing independently, so they carry no information between rows and are applied to the whole dataset before splitting. The designation and description are first merged into a single text field and lowercased. URLs, e-mail addresses, HTML tags, HTML entities, size patterns (for example 8 x 5) and bare numbers are then removed; the HTML is stripped with BeautifulSoup [7], which decodes entities and inserts separators so that a fragment such as rouge&lt;br&gt;bleu becomes rouge bleu rather than rougebleu, as a naive regular expression would produce. Special characters are removed but French accents are kept, since they are meaningful in French. The cleaned text is tokenised with NLTK's TweetTokenizer, stopwords in French, English and German are removed (the corpus is multilingual), one-character tokens are dropped, and the remaining tokens are stemmed with the French Snowball stemmer for the classical TF-IDF branch; an unstemmed copy is retained for the transformer branch, which needs raw words. Finally, a binary desc_missing indicator is built from the original column, before any fill.</w:t>
       </w:r>
     </w:p>
     <w:p>

</xml_diff>

<commit_message>
Deduped 83,502 stats + logo + real TF-IDF example + duplicate analysis + full cleaning chain
</commit_message>
<xml_diff>
--- a/downloads/Rakuten_Project_Report.docx
+++ b/downloads/Rakuten_Project_Report.docx
@@ -2,6 +2,46 @@
 <file path=word/document.xml><?xml version="1.0" encoding="utf-8"?>
 <w:document xmlns:wpc="http://schemas.microsoft.com/office/word/2010/wordprocessingCanvas" xmlns:mo="http://schemas.microsoft.com/office/mac/office/2008/main" xmlns:mc="http://schemas.openxmlformats.org/markup-compatibility/2006" xmlns:mv="urn:schemas-microsoft-com:mac:vml" xmlns:o="urn:schemas-microsoft-com:office:office" xmlns:r="http://schemas.openxmlformats.org/officeDocument/2006/relationships" xmlns:m="http://schemas.openxmlformats.org/officeDocument/2006/math" xmlns:v="urn:schemas-microsoft-com:vml" xmlns:wp14="http://schemas.microsoft.com/office/word/2010/wordprocessingDrawing" xmlns:wp="http://schemas.openxmlformats.org/drawingml/2006/wordprocessingDrawing" xmlns:w10="urn:schemas-microsoft-com:office:word" xmlns:w="http://schemas.openxmlformats.org/wordprocessingml/2006/main" xmlns:w14="http://schemas.microsoft.com/office/word/2010/wordml" xmlns:wpg="http://schemas.microsoft.com/office/word/2010/wordprocessingGroup" xmlns:wpi="http://schemas.microsoft.com/office/word/2010/wordprocessingInk" xmlns:wne="http://schemas.microsoft.com/office/word/2006/wordml" xmlns:wps="http://schemas.microsoft.com/office/word/2010/wordprocessingShape" mc:Ignorable="w14 wp14">
   <w:body>
+    <w:p>
+      <w:pPr>
+        <w:spacing w:line="240" w:lineRule="auto" w:after="120" w:before="0"/>
+        <w:jc w:val="left"/>
+      </w:pPr>
+      <w:r>
+        <w:drawing>
+          <wp:inline xmlns:a="http://schemas.openxmlformats.org/drawingml/2006/main" xmlns:pic="http://schemas.openxmlformats.org/drawingml/2006/picture">
+            <wp:extent cx="2103120" cy="967435"/>
+            <wp:docPr id="1" name="Picture 1"/>
+            <wp:cNvGraphicFramePr>
+              <a:graphicFrameLocks noChangeAspect="1"/>
+            </wp:cNvGraphicFramePr>
+            <a:graphic>
+              <a:graphicData uri="http://schemas.openxmlformats.org/drawingml/2006/picture">
+                <pic:pic>
+                  <pic:nvPicPr>
+                    <pic:cNvPr id="0" name="liora_logo.png"/>
+                    <pic:cNvPicPr/>
+                  </pic:nvPicPr>
+                  <pic:blipFill>
+                    <a:blip r:embed="rId9"/>
+                    <a:stretch>
+                      <a:fillRect/>
+                    </a:stretch>
+                  </pic:blipFill>
+                  <pic:spPr>
+                    <a:xfrm>
+                      <a:off x="0" y="0"/>
+                      <a:ext cx="2103120" cy="967435"/>
+                    </a:xfrm>
+                    <a:prstGeom prst="rect"/>
+                  </pic:spPr>
+                </pic:pic>
+              </a:graphicData>
+            </a:graphic>
+          </wp:inline>
+        </w:drawing>
+      </w:r>
+    </w:p>
     <w:p>
       <w:pPr>
         <w:spacing w:line="240" w:lineRule="auto" w:after="0" w:before="0"/>
@@ -661,7 +701,7 @@
                 <w:sz w:val="21"/>
                 <w:rFonts w:ascii="Times New Roman" w:hAnsi="Times New Roman" w:cs="Times New Roman"/>
               </w:rPr>
-              <w:t>84,916 labelled training listings; 13,812 unlabelled test listings. Text approximately 60 MB; images approximately 2.2 GB of 500 by 500 RGB JPEGs.</w:t>
+              <w:t>84,916 labelled training listings (83,502 after removing 1,414 exact duplicates); 13,812 unlabelled test listings. Text approximately 60 MB; images approximately 2.2 GB of 500 by 500 RGB JPEGs.</w:t>
             </w:r>
           </w:p>
           <w:p>
@@ -740,6 +780,23 @@
           <w:sz w:val="22"/>
           <w:rFonts w:ascii="Times New Roman" w:hAnsi="Times New Roman" w:cs="Times New Roman"/>
         </w:rPr>
+        <w:t>A duplicate analysis was also run: 1,414 listings (1.7%) were found to be exact duplicates, sharing the same designation and description, and were removed, leaving the 83,502 listings analysed in this report. A further 2,651 (3.1%) share the same title alone but differ in their description, and are retained.</w:t>
+      </w:r>
+    </w:p>
+    <w:p>
+      <w:pPr>
+        <w:spacing w:line="276" w:lineRule="auto" w:after="160" w:before="0"/>
+        <w:jc w:val="both"/>
+      </w:pPr>
+      <w:r>
+        <w:rPr>
+          <w:rFonts w:ascii="Times New Roman" w:hAnsi="Times New Roman"/>
+          <w:b w:val="0"/>
+          <w:i w:val="0"/>
+          <w:color w:val="222222"/>
+          <w:sz w:val="22"/>
+          <w:rFonts w:ascii="Times New Roman" w:hAnsi="Times New Roman" w:cs="Times New Roman"/>
+        </w:rPr>
         <w:t>Because the categories are strongly imbalanced and multilingual, the exploration below quantifies four properties of the data, each of which drives a concrete pre-processing or modelling decision. Every statistical test in this report exists to justify one such decision.</w:t>
       </w:r>
     </w:p>
@@ -794,7 +851,7 @@
           <w:sz w:val="22"/>
           <w:rFonts w:ascii="Times New Roman" w:hAnsi="Times New Roman" w:cs="Times New Roman"/>
         </w:rPr>
-        <w:t>The 27 categories are heavily imbalanced: the largest class holds 10,209 listings and the smallest 764, a ratio of 13.4 to 1. A chi-square goodness-of-fit test against a uniform distribution gives a chi-square statistic of 36,570 (p &lt; 0.001), so the imbalance is real, not sampling noise (Figure 1). Because the Rakuten challenge is scored on the weighted-F1 score, weighted-F1 is the primary metric; macro-F1 is also tracked, because the imbalance means rare-class performance must be watched. Class weighting and stratified splits are applied.</w:t>
+        <w:t>The 27 categories are heavily imbalanced: the largest class holds 9,814 listings and the smallest 693, a ratio of 14.2 to 1. A chi-square goodness-of-fit test against a uniform distribution gives a chi-square statistic of 35,282 (p &lt; 0.001), so the imbalance is real, not sampling noise (Figure 1). Because the Rakuten challenge is scored on the weighted-F1 score, weighted-F1 is the primary metric; macro-F1 is also tracked, because the imbalance means rare-class performance must be watched. Class weighting and stratified splits are applied.</w:t>
       </w:r>
     </w:p>
     <w:p>
@@ -807,8 +864,8 @@
       <w:r>
         <w:drawing>
           <wp:inline xmlns:a="http://schemas.openxmlformats.org/drawingml/2006/main" xmlns:pic="http://schemas.openxmlformats.org/drawingml/2006/picture">
-            <wp:extent cx="4206240" cy="2388122"/>
-            <wp:docPr id="1" name="Picture 1"/>
+            <wp:extent cx="4206240" cy="2995603"/>
+            <wp:docPr id="2" name="Picture 2"/>
             <wp:cNvGraphicFramePr>
               <a:graphicFrameLocks noChangeAspect="1"/>
             </wp:cNvGraphicFramePr>
@@ -820,7 +877,7 @@
                     <pic:cNvPicPr/>
                   </pic:nvPicPr>
                   <pic:blipFill>
-                    <a:blip r:embed="rId9"/>
+                    <a:blip r:embed="rId10"/>
                     <a:stretch>
                       <a:fillRect/>
                     </a:stretch>
@@ -828,7 +885,7 @@
                   <pic:spPr>
                     <a:xfrm>
                       <a:off x="0" y="0"/>
-                      <a:ext cx="4206240" cy="2388122"/>
+                      <a:ext cx="4206240" cy="2995603"/>
                     </a:xfrm>
                     <a:prstGeom prst="rect"/>
                   </pic:spPr>
@@ -864,7 +921,7 @@
           <w:sz w:val="19"/>
           <w:rFonts w:ascii="Times New Roman" w:hAnsi="Times New Roman" w:cs="Times New Roman"/>
         </w:rPr>
-        <w:t>Distribution of the 27 product categories, showing the 13.4-to-1 imbalance.</w:t>
+        <w:t>Distribution of the 27 product categories, showing the 14.2-to-1 imbalance.</w:t>
       </w:r>
     </w:p>
     <w:p>
@@ -898,7 +955,7 @@
           <w:sz w:val="22"/>
           <w:rFonts w:ascii="Times New Roman" w:hAnsi="Times New Roman" w:cs="Times New Roman"/>
         </w:rPr>
-        <w:t>35.1% of listings have no description. Crucially, the missing rate is not uniform: it varies strongly across categories. A chi-square test of independence between description present or absent and the class gives a chi-square statistic of 43,758 and a Cramer's V of 0.72 [3] (p &lt; 0.001), a strong association (Figure 2). The missingness is therefore Missing-Not-At-Random (MNAR) [2]: its very presence is informative. Rather than dropping these rows, which would discard about 35% of the data and hurt exactly the hardest categories, a binary desc_missing indicator is added so the model can use the absence as a feature.</w:t>
+        <w:t>35.5% of listings have no description. Crucially, the missing rate is not uniform: it varies strongly across categories. A chi-square test of independence between description present or absent and the class gives a chi-square statistic of 42,953 and a Cramer's V of 0.72 [3] (p &lt; 0.001), a strong association (Figure 2). The missingness is therefore Missing-Not-At-Random (MNAR) [2]: its very presence is informative. Rather than dropping these rows, which would discard about 35% of the data and hurt exactly the hardest categories, a binary desc_missing indicator is added so the model can use the absence as a feature.</w:t>
       </w:r>
     </w:p>
     <w:p>
@@ -911,8 +968,8 @@
       <w:r>
         <w:drawing>
           <wp:inline xmlns:a="http://schemas.openxmlformats.org/drawingml/2006/main" xmlns:pic="http://schemas.openxmlformats.org/drawingml/2006/picture">
-            <wp:extent cx="4206240" cy="2508499"/>
-            <wp:docPr id="2" name="Picture 2"/>
+            <wp:extent cx="4206240" cy="2336333"/>
+            <wp:docPr id="3" name="Picture 3"/>
             <wp:cNvGraphicFramePr>
               <a:graphicFrameLocks noChangeAspect="1"/>
             </wp:cNvGraphicFramePr>
@@ -924,7 +981,7 @@
                     <pic:cNvPicPr/>
                   </pic:nvPicPr>
                   <pic:blipFill>
-                    <a:blip r:embed="rId10"/>
+                    <a:blip r:embed="rId11"/>
                     <a:stretch>
                       <a:fillRect/>
                     </a:stretch>
@@ -932,7 +989,7 @@
                   <pic:spPr>
                     <a:xfrm>
                       <a:off x="0" y="0"/>
-                      <a:ext cx="4206240" cy="2508499"/>
+                      <a:ext cx="4206240" cy="2336333"/>
                     </a:xfrm>
                     <a:prstGeom prst="rect"/>
                   </pic:spPr>
@@ -1015,8 +1072,8 @@
       <w:r>
         <w:drawing>
           <wp:inline xmlns:a="http://schemas.openxmlformats.org/drawingml/2006/main" xmlns:pic="http://schemas.openxmlformats.org/drawingml/2006/picture">
-            <wp:extent cx="4206240" cy="2490537"/>
-            <wp:docPr id="3" name="Picture 3"/>
+            <wp:extent cx="4206240" cy="2123671"/>
+            <wp:docPr id="4" name="Picture 4"/>
             <wp:cNvGraphicFramePr>
               <a:graphicFrameLocks noChangeAspect="1"/>
             </wp:cNvGraphicFramePr>
@@ -1028,7 +1085,7 @@
                     <pic:cNvPicPr/>
                   </pic:nvPicPr>
                   <pic:blipFill>
-                    <a:blip r:embed="rId11"/>
+                    <a:blip r:embed="rId12"/>
                     <a:stretch>
                       <a:fillRect/>
                     </a:stretch>
@@ -1036,7 +1093,7 @@
                   <pic:spPr>
                     <a:xfrm>
                       <a:off x="0" y="0"/>
-                      <a:ext cx="4206240" cy="2490537"/>
+                      <a:ext cx="4206240" cy="2123671"/>
                     </a:xfrm>
                     <a:prstGeom prst="rect"/>
                   </pic:spPr>
@@ -1120,7 +1177,7 @@
         <w:drawing>
           <wp:inline xmlns:a="http://schemas.openxmlformats.org/drawingml/2006/main" xmlns:pic="http://schemas.openxmlformats.org/drawingml/2006/picture">
             <wp:extent cx="4206240" cy="2453640"/>
-            <wp:docPr id="4" name="Picture 4"/>
+            <wp:docPr id="5" name="Picture 5"/>
             <wp:cNvGraphicFramePr>
               <a:graphicFrameLocks noChangeAspect="1"/>
             </wp:cNvGraphicFramePr>
@@ -1132,7 +1189,7 @@
                     <pic:cNvPicPr/>
                   </pic:nvPicPr>
                   <pic:blipFill>
-                    <a:blip r:embed="rId12"/>
+                    <a:blip r:embed="rId13"/>
                     <a:stretch>
                       <a:fillRect/>
                     </a:stretch>
@@ -1210,7 +1267,7 @@
           <w:sz w:val="22"/>
           <w:rFonts w:ascii="Times New Roman" w:hAnsi="Times New Roman" w:cs="Times New Roman"/>
         </w:rPr>
-        <w:t>Counting how often each word occurs shows that the most frequent words are almost all stopwords, such as de, la, et, pour and les (Figure 5). These appear in nearly every listing and carry no category signal, which is why they are removed with the NLTK French, English and German stopword lists before vectorisation; TF-IDF [6] then further down-weights any common terms that survive through its inverse-document-frequency term. At the other extreme, the least frequent words are one-off typos and serial numbers that appear only once; these are removed by the minimum-document-frequency threshold and by capping the vocabulary at the 20,000 most useful terms. The discriminative words sit in between.</w:t>
+        <w:t>In the raw text the most frequent words are almost all stopwords, such as de, la, et, pour and les; these appear in nearly every listing and carry no category signal, so they are removed with the NLTK French, English and German stopword lists before vectorisation. Figure 5 therefore shows the twenty most frequent terms after stopword removal, as unigrams and bigrams: they are genuine content words and word-pairs, such as cm, couleur, taille, piscine and eau, which are exactly the discriminative features TF-IDF [6] keeps. At the other extreme, the rarest terms are one-off typos and serial numbers that appear only once; these are removed by the minimum-document-frequency threshold and by capping the vocabulary at the 20,000 most useful terms.</w:t>
       </w:r>
     </w:p>
     <w:p>
@@ -1223,8 +1280,8 @@
       <w:r>
         <w:drawing>
           <wp:inline xmlns:a="http://schemas.openxmlformats.org/drawingml/2006/main" xmlns:pic="http://schemas.openxmlformats.org/drawingml/2006/picture">
-            <wp:extent cx="4206240" cy="2791932"/>
-            <wp:docPr id="5" name="Picture 5"/>
+            <wp:extent cx="4206240" cy="1644257"/>
+            <wp:docPr id="6" name="Picture 6"/>
             <wp:cNvGraphicFramePr>
               <a:graphicFrameLocks noChangeAspect="1"/>
             </wp:cNvGraphicFramePr>
@@ -1236,7 +1293,7 @@
                     <pic:cNvPicPr/>
                   </pic:nvPicPr>
                   <pic:blipFill>
-                    <a:blip r:embed="rId13"/>
+                    <a:blip r:embed="rId14"/>
                     <a:stretch>
                       <a:fillRect/>
                     </a:stretch>
@@ -1244,7 +1301,7 @@
                   <pic:spPr>
                     <a:xfrm>
                       <a:off x="0" y="0"/>
-                      <a:ext cx="4206240" cy="2791932"/>
+                      <a:ext cx="4206240" cy="1644257"/>
                     </a:xfrm>
                     <a:prstGeom prst="rect"/>
                   </pic:spPr>
@@ -1280,7 +1337,7 @@
           <w:sz w:val="19"/>
           <w:rFonts w:ascii="Times New Roman" w:hAnsi="Times New Roman" w:cs="Times New Roman"/>
         </w:rPr>
-        <w:t>The 20 most frequent words in the corpus are all stopwords, motivating the inverse-document-frequency weighting in TF-IDF.</w:t>
+        <w:t>Left: the most frequent raw words are all stopwords, removed by the NLTK French, English and German lists. Right: after removal, the most frequent unigrams and bigrams are content words such as couleur, taille and piscine (bigrams shown in purple).</w:t>
       </w:r>
     </w:p>
     <w:p>
@@ -1488,7 +1545,7 @@
                 <w:sz w:val="20"/>
                 <w:rFonts w:ascii="Times New Roman" w:hAnsi="Times New Roman" w:cs="Times New Roman"/>
               </w:rPr>
-              <w:t>13.4:1 gap; chi-square = 36,570; p &lt; 0.001</w:t>
+              <w:t>14.2:1 gap; chi-square = 35,282; p &lt; 0.001</w:t>
             </w:r>
           </w:p>
         </w:tc>
@@ -1577,7 +1634,7 @@
                 <w:sz w:val="20"/>
                 <w:rFonts w:ascii="Times New Roman" w:hAnsi="Times New Roman" w:cs="Times New Roman"/>
               </w:rPr>
-              <w:t>35.1%; MNAR (chi-square = 43,758, V = 0.72; p &lt; 0.001)</w:t>
+              <w:t>35.5%; MNAR (chi-square = 42,953, V = 0.72; p &lt; 0.001)</w:t>
             </w:r>
           </w:p>
         </w:tc>
@@ -1993,7 +2050,7 @@
           <w:sz w:val="18"/>
           <w:rFonts w:ascii="Times New Roman" w:hAnsi="Times New Roman" w:cs="Times New Roman"/>
         </w:rPr>
-        <w:t>Percentages for languages are Wilson 95%-CI point estimates from a labelled sample. Chi-square and Kruskal-Wallis statistics are computed on the full training set of 84,916 listings.</w:t>
+        <w:t>Percentages for languages are Wilson 95%-CI point estimates from a labelled sample. Chi-square and Kruskal-Wallis statistics are computed on the full training set of 83,502 listings.</w:t>
       </w:r>
     </w:p>
     <w:p>
@@ -2115,7 +2172,7 @@
           <w:sz w:val="22"/>
           <w:rFonts w:ascii="Times New Roman" w:hAnsi="Times New Roman" w:cs="Times New Roman"/>
         </w:rPr>
-        <w:t>TF-IDF (implemented with scikit-learn [8]) converts each listing's merged text into a numeric vector [6]. For each term, the term frequency (how often it occurs in the listing) is multiplied by the inverse document frequency, defined as the logarithm of the number of documents divided by the number of documents containing the term. Ubiquitous words such as de, le and et therefore receive near-zero weight, while rare, discriminative words such as nintendo switch receive high weight. Both unigrams (single words) and bigrams (adjacent word-pairs) are used, because some category signal lives only in the pair: jeux video (video games) is a strong marker that neither jeux nor video conveys alone. Bigrams greatly enlarge the vocabulary, so it is capped at the 20,000 most useful terms out of approximately 280,000.</w:t>
+        <w:t>TF-IDF (implemented with scikit-learn [8]) converts each listing's merged text into a numeric vector [6]. For each term, the term frequency (how often it occurs in the listing) is multiplied by the inverse document frequency, defined as the logarithm of the number of documents divided by the number of documents containing the term. Because stopwords such as de, le and et have already been removed, the vocabulary contains only content words; among these, common words receive a lower weight through the inverse-document-frequency term than rare ones. For example, in our corpus couleur appears in 18,030 documents and so has a low IDF of 2.5, whereas nintendo appears in only 825 documents and has a high IDF of 5.6, giving it far more weight. Both unigrams (single words) and bigrams (adjacent word-pairs) are used, because some category signal lives only in the pair: jeux video (video games) is a strong marker that neither jeux nor video conveys alone. Bigrams greatly enlarge the vocabulary, so it is capped at the 20,000 most useful terms out of approximately 280,000.</w:t>
       </w:r>
     </w:p>
     <w:p>
@@ -2132,7 +2189,7 @@
           <w:sz w:val="22"/>
           <w:rFonts w:ascii="Times New Roman" w:hAnsi="Times New Roman" w:cs="Times New Roman"/>
         </w:rPr>
-        <w:t>The result is a sparse matrix whose rows are the listings and whose columns are the 20,000 vocabulary terms, with each cell a TF-IDF score; approximately 99% of the entries are zero. The vectorizer is fitted on the training set only and then applied to transform both the training and test sets, producing two sparse matrices that share the same vocabulary. The deliverable handed to the modelling stage is therefore a numeric feature set of approximately 67,900 training and 17,000 test rows, comprising the 20,000 sparse TF-IDF features together with the desc_missing and length features, over the 27 target categories.</w:t>
+        <w:t>The result is a sparse matrix whose rows are the listings and whose columns are the 20,000 vocabulary terms, with each cell a TF-IDF score; approximately 99% of the entries are zero. The vectorizer is fitted on the training set only and then applied to transform both the training and test sets, producing two sparse matrices that share the same vocabulary. The deliverable handed to the modelling stage is therefore a numeric feature set of approximately 66,800 training and 16,700 test rows, comprising the 20,000 sparse TF-IDF features together with the desc_missing and length features, over the 27 target categories.</w:t>
       </w:r>
     </w:p>
     <w:p>
@@ -2388,7 +2445,7 @@
       </w:r>
     </w:p>
     <w:sectPr>
-      <w:footerReference w:type="default" r:id="rId14"/>
+      <w:footerReference w:type="default" r:id="rId15"/>
       <w:pgSz w:w="12240" w:h="15840"/>
       <w:pgMar w:top="1440" w:right="1440" w:bottom="1440" w:left="1440" w:header="720" w:footer="720" w:gutter="0"/>
       <w:cols w:space="720"/>

</xml_diff>

<commit_message>
EDA figures: label categories with prdtypecode; refresh report PDF/DOCX
</commit_message>
<xml_diff>
--- a/downloads/Rakuten_Project_Report.docx
+++ b/downloads/Rakuten_Project_Report.docx
@@ -7,40 +7,6 @@
         <w:spacing w:line="240" w:lineRule="auto" w:after="120" w:before="0"/>
         <w:jc w:val="left"/>
       </w:pPr>
-      <w:r>
-        <w:drawing>
-          <wp:inline xmlns:a="http://schemas.openxmlformats.org/drawingml/2006/main" xmlns:pic="http://schemas.openxmlformats.org/drawingml/2006/picture">
-            <wp:extent cx="2103120" cy="967435"/>
-            <wp:docPr id="1" name="Picture 1"/>
-            <wp:cNvGraphicFramePr>
-              <a:graphicFrameLocks noChangeAspect="1"/>
-            </wp:cNvGraphicFramePr>
-            <a:graphic>
-              <a:graphicData uri="http://schemas.openxmlformats.org/drawingml/2006/picture">
-                <pic:pic>
-                  <pic:nvPicPr>
-                    <pic:cNvPr id="0" name="liora_logo.png"/>
-                    <pic:cNvPicPr/>
-                  </pic:nvPicPr>
-                  <pic:blipFill>
-                    <a:blip r:embed="rId9"/>
-                    <a:stretch>
-                      <a:fillRect/>
-                    </a:stretch>
-                  </pic:blipFill>
-                  <pic:spPr>
-                    <a:xfrm>
-                      <a:off x="0" y="0"/>
-                      <a:ext cx="2103120" cy="967435"/>
-                    </a:xfrm>
-                    <a:prstGeom prst="rect"/>
-                  </pic:spPr>
-                </pic:pic>
-              </a:graphicData>
-            </a:graphic>
-          </wp:inline>
-        </w:drawing>
-      </w:r>
     </w:p>
     <w:p>
       <w:pPr>
@@ -864,8 +830,8 @@
       <w:r>
         <w:drawing>
           <wp:inline xmlns:a="http://schemas.openxmlformats.org/drawingml/2006/main" xmlns:pic="http://schemas.openxmlformats.org/drawingml/2006/picture">
-            <wp:extent cx="4206240" cy="2995603"/>
-            <wp:docPr id="2" name="Picture 2"/>
+            <wp:extent cx="4206240" cy="2847361"/>
+            <wp:docPr id="1" name="Picture 1"/>
             <wp:cNvGraphicFramePr>
               <a:graphicFrameLocks noChangeAspect="1"/>
             </wp:cNvGraphicFramePr>
@@ -877,7 +843,7 @@
                     <pic:cNvPicPr/>
                   </pic:nvPicPr>
                   <pic:blipFill>
-                    <a:blip r:embed="rId10"/>
+                    <a:blip r:embed="rId9"/>
                     <a:stretch>
                       <a:fillRect/>
                     </a:stretch>
@@ -885,7 +851,7 @@
                   <pic:spPr>
                     <a:xfrm>
                       <a:off x="0" y="0"/>
-                      <a:ext cx="4206240" cy="2995603"/>
+                      <a:ext cx="4206240" cy="2847361"/>
                     </a:xfrm>
                     <a:prstGeom prst="rect"/>
                   </pic:spPr>
@@ -968,8 +934,8 @@
       <w:r>
         <w:drawing>
           <wp:inline xmlns:a="http://schemas.openxmlformats.org/drawingml/2006/main" xmlns:pic="http://schemas.openxmlformats.org/drawingml/2006/picture">
-            <wp:extent cx="4206240" cy="2336333"/>
-            <wp:docPr id="3" name="Picture 3"/>
+            <wp:extent cx="4206240" cy="2504414"/>
+            <wp:docPr id="2" name="Picture 2"/>
             <wp:cNvGraphicFramePr>
               <a:graphicFrameLocks noChangeAspect="1"/>
             </wp:cNvGraphicFramePr>
@@ -981,7 +947,7 @@
                     <pic:cNvPicPr/>
                   </pic:nvPicPr>
                   <pic:blipFill>
-                    <a:blip r:embed="rId11"/>
+                    <a:blip r:embed="rId10"/>
                     <a:stretch>
                       <a:fillRect/>
                     </a:stretch>
@@ -989,7 +955,7 @@
                   <pic:spPr>
                     <a:xfrm>
                       <a:off x="0" y="0"/>
-                      <a:ext cx="4206240" cy="2336333"/>
+                      <a:ext cx="4206240" cy="2504414"/>
                     </a:xfrm>
                     <a:prstGeom prst="rect"/>
                   </pic:spPr>
@@ -1073,7 +1039,7 @@
         <w:drawing>
           <wp:inline xmlns:a="http://schemas.openxmlformats.org/drawingml/2006/main" xmlns:pic="http://schemas.openxmlformats.org/drawingml/2006/picture">
             <wp:extent cx="4206240" cy="2123671"/>
-            <wp:docPr id="4" name="Picture 4"/>
+            <wp:docPr id="3" name="Picture 3"/>
             <wp:cNvGraphicFramePr>
               <a:graphicFrameLocks noChangeAspect="1"/>
             </wp:cNvGraphicFramePr>
@@ -1085,7 +1051,7 @@
                     <pic:cNvPicPr/>
                   </pic:nvPicPr>
                   <pic:blipFill>
-                    <a:blip r:embed="rId12"/>
+                    <a:blip r:embed="rId11"/>
                     <a:stretch>
                       <a:fillRect/>
                     </a:stretch>
@@ -1177,7 +1143,7 @@
         <w:drawing>
           <wp:inline xmlns:a="http://schemas.openxmlformats.org/drawingml/2006/main" xmlns:pic="http://schemas.openxmlformats.org/drawingml/2006/picture">
             <wp:extent cx="4206240" cy="2453640"/>
-            <wp:docPr id="5" name="Picture 5"/>
+            <wp:docPr id="4" name="Picture 4"/>
             <wp:cNvGraphicFramePr>
               <a:graphicFrameLocks noChangeAspect="1"/>
             </wp:cNvGraphicFramePr>
@@ -1189,7 +1155,7 @@
                     <pic:cNvPicPr/>
                   </pic:nvPicPr>
                   <pic:blipFill>
-                    <a:blip r:embed="rId13"/>
+                    <a:blip r:embed="rId12"/>
                     <a:stretch>
                       <a:fillRect/>
                     </a:stretch>
@@ -1281,7 +1247,7 @@
         <w:drawing>
           <wp:inline xmlns:a="http://schemas.openxmlformats.org/drawingml/2006/main" xmlns:pic="http://schemas.openxmlformats.org/drawingml/2006/picture">
             <wp:extent cx="4206240" cy="1644257"/>
-            <wp:docPr id="6" name="Picture 6"/>
+            <wp:docPr id="5" name="Picture 5"/>
             <wp:cNvGraphicFramePr>
               <a:graphicFrameLocks noChangeAspect="1"/>
             </wp:cNvGraphicFramePr>
@@ -1293,7 +1259,7 @@
                     <pic:cNvPicPr/>
                   </pic:nvPicPr>
                   <pic:blipFill>
-                    <a:blip r:embed="rId14"/>
+                    <a:blip r:embed="rId13"/>
                     <a:stretch>
                       <a:fillRect/>
                     </a:stretch>
@@ -2445,7 +2411,7 @@
       </w:r>
     </w:p>
     <w:sectPr>
-      <w:footerReference w:type="default" r:id="rId15"/>
+      <w:footerReference w:type="default" r:id="rId14"/>
       <w:pgSz w:w="12240" w:h="15840"/>
       <w:pgMar w:top="1440" w:right="1440" w:bottom="1440" w:left="1440" w:header="720" w:footer="720" w:gutter="0"/>
       <w:cols w:space="720"/>

</xml_diff>